<commit_message>
chore(manuscript): re-render supplementary after Table S2 change
Co-Authored-By: Claude Opus 5.5 <noreply@anthropic.com>
</commit_message>
<xml_diff>
--- a/Manuscript/supplementary.docx
+++ b/Manuscript/supplementary.docx
@@ -1900,14 +1900,14 @@
               <w:tblLook w:firstRow="1" w:lastRow="0" w:firstColumn="0" w:lastColumn="0" w:noHBand="0" w:noVBand="0" w:val="0020"/>
             </w:tblPr>
             <w:tblGrid>
-              <w:gridCol w:w="2368"/>
-              <w:gridCol w:w="1998"/>
-              <w:gridCol w:w="740"/>
-              <w:gridCol w:w="666"/>
-              <w:gridCol w:w="592"/>
-              <w:gridCol w:w="444"/>
-              <w:gridCol w:w="666"/>
-              <w:gridCol w:w="444"/>
+              <w:gridCol w:w="2390"/>
+              <w:gridCol w:w="2017"/>
+              <w:gridCol w:w="747"/>
+              <w:gridCol w:w="672"/>
+              <w:gridCol w:w="597"/>
+              <w:gridCol w:w="448"/>
+              <w:gridCol w:w="597"/>
+              <w:gridCol w:w="448"/>
             </w:tblGrid>
             <w:tr>
               <w:trPr>
@@ -2067,46 +2067,46 @@
                     <w:jc w:val="center"/>
                   </w:pPr>
                   <w:r>
-                    <w:t xml:space="preserve">0.05410</w:t>
-                  </w:r>
-                </w:p>
-              </w:tc>
-              <w:tc>
-                <w:tcPr/>
-                <w:p>
-                  <w:pPr>
-                    <w:pStyle w:val="Compact"/>
-                    <w:jc w:val="right"/>
-                    <w:jc w:val="center"/>
-                  </w:pPr>
-                  <w:r>
-                    <w:t xml:space="preserve">0.19900</w:t>
-                  </w:r>
-                </w:p>
-              </w:tc>
-              <w:tc>
-                <w:tcPr/>
-                <w:p>
-                  <w:pPr>
-                    <w:pStyle w:val="Compact"/>
-                    <w:jc w:val="right"/>
-                    <w:jc w:val="center"/>
-                  </w:pPr>
-                  <w:r>
-                    <w:t xml:space="preserve">0.27</w:t>
-                  </w:r>
-                </w:p>
-              </w:tc>
-              <w:tc>
-                <w:tcPr/>
-                <w:p>
-                  <w:pPr>
-                    <w:pStyle w:val="Compact"/>
-                    <w:jc w:val="right"/>
-                    <w:jc w:val="center"/>
-                  </w:pPr>
-                  <w:r>
-                    <w:t xml:space="preserve">0.785000</w:t>
+                    <w:t xml:space="preserve">-0.02200</w:t>
+                  </w:r>
+                </w:p>
+              </w:tc>
+              <w:tc>
+                <w:tcPr/>
+                <w:p>
+                  <w:pPr>
+                    <w:pStyle w:val="Compact"/>
+                    <w:jc w:val="right"/>
+                    <w:jc w:val="center"/>
+                  </w:pPr>
+                  <w:r>
+                    <w:t xml:space="preserve">0.19600</w:t>
+                  </w:r>
+                </w:p>
+              </w:tc>
+              <w:tc>
+                <w:tcPr/>
+                <w:p>
+                  <w:pPr>
+                    <w:pStyle w:val="Compact"/>
+                    <w:jc w:val="right"/>
+                    <w:jc w:val="center"/>
+                  </w:pPr>
+                  <w:r>
+                    <w:t xml:space="preserve">-0.11</w:t>
+                  </w:r>
+                </w:p>
+              </w:tc>
+              <w:tc>
+                <w:tcPr/>
+                <w:p>
+                  <w:pPr>
+                    <w:pStyle w:val="Compact"/>
+                    <w:jc w:val="right"/>
+                    <w:jc w:val="center"/>
+                  </w:pPr>
+                  <w:r>
+                    <w:t xml:space="preserve">0.91100</w:t>
                   </w:r>
                 </w:p>
               </w:tc>
@@ -2173,46 +2173,46 @@
                     <w:jc w:val="center"/>
                   </w:pPr>
                   <w:r>
-                    <w:t xml:space="preserve">-0.70000</w:t>
-                  </w:r>
-                </w:p>
-              </w:tc>
-              <w:tc>
-                <w:tcPr/>
-                <w:p>
-                  <w:pPr>
-                    <w:pStyle w:val="Compact"/>
-                    <w:jc w:val="right"/>
-                    <w:jc w:val="center"/>
-                  </w:pPr>
-                  <w:r>
-                    <w:t xml:space="preserve">0.22500</w:t>
-                  </w:r>
-                </w:p>
-              </w:tc>
-              <w:tc>
-                <w:tcPr/>
-                <w:p>
-                  <w:pPr>
-                    <w:pStyle w:val="Compact"/>
-                    <w:jc w:val="right"/>
-                    <w:jc w:val="center"/>
-                  </w:pPr>
-                  <w:r>
-                    <w:t xml:space="preserve">-3.11</w:t>
-                  </w:r>
-                </w:p>
-              </w:tc>
-              <w:tc>
-                <w:tcPr/>
-                <w:p>
-                  <w:pPr>
-                    <w:pStyle w:val="Compact"/>
-                    <w:jc w:val="right"/>
-                    <w:jc w:val="center"/>
-                  </w:pPr>
-                  <w:r>
-                    <w:t xml:space="preserve">0.001870</w:t>
+                    <w:t xml:space="preserve">-0.53800</w:t>
+                  </w:r>
+                </w:p>
+              </w:tc>
+              <w:tc>
+                <w:tcPr/>
+                <w:p>
+                  <w:pPr>
+                    <w:pStyle w:val="Compact"/>
+                    <w:jc w:val="right"/>
+                    <w:jc w:val="center"/>
+                  </w:pPr>
+                  <w:r>
+                    <w:t xml:space="preserve">0.21900</w:t>
+                  </w:r>
+                </w:p>
+              </w:tc>
+              <w:tc>
+                <w:tcPr/>
+                <w:p>
+                  <w:pPr>
+                    <w:pStyle w:val="Compact"/>
+                    <w:jc w:val="right"/>
+                    <w:jc w:val="center"/>
+                  </w:pPr>
+                  <w:r>
+                    <w:t xml:space="preserve">-2.46</w:t>
+                  </w:r>
+                </w:p>
+              </w:tc>
+              <w:tc>
+                <w:tcPr/>
+                <w:p>
+                  <w:pPr>
+                    <w:pStyle w:val="Compact"/>
+                    <w:jc w:val="right"/>
+                    <w:jc w:val="center"/>
+                  </w:pPr>
+                  <w:r>
+                    <w:t xml:space="preserve">0.01400</w:t>
                   </w:r>
                 </w:p>
               </w:tc>
@@ -2279,46 +2279,46 @@
                     <w:jc w:val="center"/>
                   </w:pPr>
                   <w:r>
-                    <w:t xml:space="preserve">-0.06020</w:t>
-                  </w:r>
-                </w:p>
-              </w:tc>
-              <w:tc>
-                <w:tcPr/>
-                <w:p>
-                  <w:pPr>
-                    <w:pStyle w:val="Compact"/>
-                    <w:jc w:val="right"/>
-                    <w:jc w:val="center"/>
-                  </w:pPr>
-                  <w:r>
-                    <w:t xml:space="preserve">0.20100</w:t>
-                  </w:r>
-                </w:p>
-              </w:tc>
-              <w:tc>
-                <w:tcPr/>
-                <w:p>
-                  <w:pPr>
-                    <w:pStyle w:val="Compact"/>
-                    <w:jc w:val="right"/>
-                    <w:jc w:val="center"/>
-                  </w:pPr>
-                  <w:r>
-                    <w:t xml:space="preserve">-0.30</w:t>
-                  </w:r>
-                </w:p>
-              </w:tc>
-              <w:tc>
-                <w:tcPr/>
-                <w:p>
-                  <w:pPr>
-                    <w:pStyle w:val="Compact"/>
-                    <w:jc w:val="right"/>
-                    <w:jc w:val="center"/>
-                  </w:pPr>
-                  <w:r>
-                    <w:t xml:space="preserve">0.765000</w:t>
+                    <w:t xml:space="preserve">-0.16300</w:t>
+                  </w:r>
+                </w:p>
+              </w:tc>
+              <w:tc>
+                <w:tcPr/>
+                <w:p>
+                  <w:pPr>
+                    <w:pStyle w:val="Compact"/>
+                    <w:jc w:val="right"/>
+                    <w:jc w:val="center"/>
+                  </w:pPr>
+                  <w:r>
+                    <w:t xml:space="preserve">0.19500</w:t>
+                  </w:r>
+                </w:p>
+              </w:tc>
+              <w:tc>
+                <w:tcPr/>
+                <w:p>
+                  <w:pPr>
+                    <w:pStyle w:val="Compact"/>
+                    <w:jc w:val="right"/>
+                    <w:jc w:val="center"/>
+                  </w:pPr>
+                  <w:r>
+                    <w:t xml:space="preserve">-0.83</w:t>
+                  </w:r>
+                </w:p>
+              </w:tc>
+              <w:tc>
+                <w:tcPr/>
+                <w:p>
+                  <w:pPr>
+                    <w:pStyle w:val="Compact"/>
+                    <w:jc w:val="right"/>
+                    <w:jc w:val="center"/>
+                  </w:pPr>
+                  <w:r>
+                    <w:t xml:space="preserve">0.40400</w:t>
                   </w:r>
                 </w:p>
               </w:tc>
@@ -2385,46 +2385,46 @@
                     <w:jc w:val="center"/>
                   </w:pPr>
                   <w:r>
-                    <w:t xml:space="preserve">0.00680</w:t>
-                  </w:r>
-                </w:p>
-              </w:tc>
-              <w:tc>
-                <w:tcPr/>
-                <w:p>
-                  <w:pPr>
-                    <w:pStyle w:val="Compact"/>
-                    <w:jc w:val="right"/>
-                    <w:jc w:val="center"/>
-                  </w:pPr>
-                  <w:r>
-                    <w:t xml:space="preserve">0.00691</w:t>
-                  </w:r>
-                </w:p>
-              </w:tc>
-              <w:tc>
-                <w:tcPr/>
-                <w:p>
-                  <w:pPr>
-                    <w:pStyle w:val="Compact"/>
-                    <w:jc w:val="right"/>
-                    <w:jc w:val="center"/>
-                  </w:pPr>
-                  <w:r>
-                    <w:t xml:space="preserve">0.98</w:t>
-                  </w:r>
-                </w:p>
-              </w:tc>
-              <w:tc>
-                <w:tcPr/>
-                <w:p>
-                  <w:pPr>
-                    <w:pStyle w:val="Compact"/>
-                    <w:jc w:val="right"/>
-                    <w:jc w:val="center"/>
-                  </w:pPr>
-                  <w:r>
-                    <w:t xml:space="preserve">0.326000</w:t>
+                    <w:t xml:space="preserve">0.00727</w:t>
+                  </w:r>
+                </w:p>
+              </w:tc>
+              <w:tc>
+                <w:tcPr/>
+                <w:p>
+                  <w:pPr>
+                    <w:pStyle w:val="Compact"/>
+                    <w:jc w:val="right"/>
+                    <w:jc w:val="center"/>
+                  </w:pPr>
+                  <w:r>
+                    <w:t xml:space="preserve">0.00687</w:t>
+                  </w:r>
+                </w:p>
+              </w:tc>
+              <w:tc>
+                <w:tcPr/>
+                <w:p>
+                  <w:pPr>
+                    <w:pStyle w:val="Compact"/>
+                    <w:jc w:val="right"/>
+                    <w:jc w:val="center"/>
+                  </w:pPr>
+                  <w:r>
+                    <w:t xml:space="preserve">1.06</w:t>
+                  </w:r>
+                </w:p>
+              </w:tc>
+              <w:tc>
+                <w:tcPr/>
+                <w:p>
+                  <w:pPr>
+                    <w:pStyle w:val="Compact"/>
+                    <w:jc w:val="right"/>
+                    <w:jc w:val="center"/>
+                  </w:pPr>
+                  <w:r>
+                    <w:t xml:space="preserve">0.29000</w:t>
                   </w:r>
                 </w:p>
               </w:tc>
@@ -2491,46 +2491,46 @@
                     <w:jc w:val="center"/>
                   </w:pPr>
                   <w:r>
-                    <w:t xml:space="preserve">-0.00332</w:t>
-                  </w:r>
-                </w:p>
-              </w:tc>
-              <w:tc>
-                <w:tcPr/>
-                <w:p>
-                  <w:pPr>
-                    <w:pStyle w:val="Compact"/>
-                    <w:jc w:val="right"/>
-                    <w:jc w:val="center"/>
-                  </w:pPr>
-                  <w:r>
-                    <w:t xml:space="preserve">0.00446</w:t>
-                  </w:r>
-                </w:p>
-              </w:tc>
-              <w:tc>
-                <w:tcPr/>
-                <w:p>
-                  <w:pPr>
-                    <w:pStyle w:val="Compact"/>
-                    <w:jc w:val="right"/>
-                    <w:jc w:val="center"/>
-                  </w:pPr>
-                  <w:r>
-                    <w:t xml:space="preserve">-0.74</w:t>
-                  </w:r>
-                </w:p>
-              </w:tc>
-              <w:tc>
-                <w:tcPr/>
-                <w:p>
-                  <w:pPr>
-                    <w:pStyle w:val="Compact"/>
-                    <w:jc w:val="right"/>
-                    <w:jc w:val="center"/>
-                  </w:pPr>
-                  <w:r>
-                    <w:t xml:space="preserve">0.457000</w:t>
+                    <w:t xml:space="preserve">-0.00189</w:t>
+                  </w:r>
+                </w:p>
+              </w:tc>
+              <w:tc>
+                <w:tcPr/>
+                <w:p>
+                  <w:pPr>
+                    <w:pStyle w:val="Compact"/>
+                    <w:jc w:val="right"/>
+                    <w:jc w:val="center"/>
+                  </w:pPr>
+                  <w:r>
+                    <w:t xml:space="preserve">0.00521</w:t>
+                  </w:r>
+                </w:p>
+              </w:tc>
+              <w:tc>
+                <w:tcPr/>
+                <w:p>
+                  <w:pPr>
+                    <w:pStyle w:val="Compact"/>
+                    <w:jc w:val="right"/>
+                    <w:jc w:val="center"/>
+                  </w:pPr>
+                  <w:r>
+                    <w:t xml:space="preserve">-0.36</w:t>
+                  </w:r>
+                </w:p>
+              </w:tc>
+              <w:tc>
+                <w:tcPr/>
+                <w:p>
+                  <w:pPr>
+                    <w:pStyle w:val="Compact"/>
+                    <w:jc w:val="right"/>
+                    <w:jc w:val="center"/>
+                  </w:pPr>
+                  <w:r>
+                    <w:t xml:space="preserve">0.71700</w:t>
                   </w:r>
                 </w:p>
               </w:tc>
@@ -2597,46 +2597,46 @@
                     <w:jc w:val="center"/>
                   </w:pPr>
                   <w:r>
-                    <w:t xml:space="preserve">0.00604</w:t>
-                  </w:r>
-                </w:p>
-              </w:tc>
-              <w:tc>
-                <w:tcPr/>
-                <w:p>
-                  <w:pPr>
-                    <w:pStyle w:val="Compact"/>
-                    <w:jc w:val="right"/>
-                    <w:jc w:val="center"/>
-                  </w:pPr>
-                  <w:r>
-                    <w:t xml:space="preserve">0.00688</w:t>
-                  </w:r>
-                </w:p>
-              </w:tc>
-              <w:tc>
-                <w:tcPr/>
-                <w:p>
-                  <w:pPr>
-                    <w:pStyle w:val="Compact"/>
-                    <w:jc w:val="right"/>
-                    <w:jc w:val="center"/>
-                  </w:pPr>
-                  <w:r>
-                    <w:t xml:space="preserve">0.88</w:t>
-                  </w:r>
-                </w:p>
-              </w:tc>
-              <w:tc>
-                <w:tcPr/>
-                <w:p>
-                  <w:pPr>
-                    <w:pStyle w:val="Compact"/>
-                    <w:jc w:val="right"/>
-                    <w:jc w:val="center"/>
-                  </w:pPr>
-                  <w:r>
-                    <w:t xml:space="preserve">0.381000</w:t>
+                    <w:t xml:space="preserve">0.00640</w:t>
+                  </w:r>
+                </w:p>
+              </w:tc>
+              <w:tc>
+                <w:tcPr/>
+                <w:p>
+                  <w:pPr>
+                    <w:pStyle w:val="Compact"/>
+                    <w:jc w:val="right"/>
+                    <w:jc w:val="center"/>
+                  </w:pPr>
+                  <w:r>
+                    <w:t xml:space="preserve">0.00681</w:t>
+                  </w:r>
+                </w:p>
+              </w:tc>
+              <w:tc>
+                <w:tcPr/>
+                <w:p>
+                  <w:pPr>
+                    <w:pStyle w:val="Compact"/>
+                    <w:jc w:val="right"/>
+                    <w:jc w:val="center"/>
+                  </w:pPr>
+                  <w:r>
+                    <w:t xml:space="preserve">0.94</w:t>
+                  </w:r>
+                </w:p>
+              </w:tc>
+              <w:tc>
+                <w:tcPr/>
+                <w:p>
+                  <w:pPr>
+                    <w:pStyle w:val="Compact"/>
+                    <w:jc w:val="right"/>
+                    <w:jc w:val="center"/>
+                  </w:pPr>
+                  <w:r>
+                    <w:t xml:space="preserve">0.34700</w:t>
                   </w:r>
                 </w:p>
               </w:tc>
@@ -2703,46 +2703,46 @@
                     <w:jc w:val="center"/>
                   </w:pPr>
                   <w:r>
-                    <w:t xml:space="preserve">0.01180</w:t>
-                  </w:r>
-                </w:p>
-              </w:tc>
-              <w:tc>
-                <w:tcPr/>
-                <w:p>
-                  <w:pPr>
-                    <w:pStyle w:val="Compact"/>
-                    <w:jc w:val="right"/>
-                    <w:jc w:val="center"/>
-                  </w:pPr>
-                  <w:r>
-                    <w:t xml:space="preserve">0.01010</w:t>
-                  </w:r>
-                </w:p>
-              </w:tc>
-              <w:tc>
-                <w:tcPr/>
-                <w:p>
-                  <w:pPr>
-                    <w:pStyle w:val="Compact"/>
-                    <w:jc w:val="right"/>
-                    <w:jc w:val="center"/>
-                  </w:pPr>
-                  <w:r>
-                    <w:t xml:space="preserve">1.18</w:t>
-                  </w:r>
-                </w:p>
-              </w:tc>
-              <w:tc>
-                <w:tcPr/>
-                <w:p>
-                  <w:pPr>
-                    <w:pStyle w:val="Compact"/>
-                    <w:jc w:val="right"/>
-                    <w:jc w:val="center"/>
-                  </w:pPr>
-                  <w:r>
-                    <w:t xml:space="preserve">0.239000</w:t>
+                    <w:t xml:space="preserve">0.01570</w:t>
+                  </w:r>
+                </w:p>
+              </w:tc>
+              <w:tc>
+                <w:tcPr/>
+                <w:p>
+                  <w:pPr>
+                    <w:pStyle w:val="Compact"/>
+                    <w:jc w:val="right"/>
+                    <w:jc w:val="center"/>
+                  </w:pPr>
+                  <w:r>
+                    <w:t xml:space="preserve">0.00995</w:t>
+                  </w:r>
+                </w:p>
+              </w:tc>
+              <w:tc>
+                <w:tcPr/>
+                <w:p>
+                  <w:pPr>
+                    <w:pStyle w:val="Compact"/>
+                    <w:jc w:val="right"/>
+                    <w:jc w:val="center"/>
+                  </w:pPr>
+                  <w:r>
+                    <w:t xml:space="preserve">1.58</w:t>
+                  </w:r>
+                </w:p>
+              </w:tc>
+              <w:tc>
+                <w:tcPr/>
+                <w:p>
+                  <w:pPr>
+                    <w:pStyle w:val="Compact"/>
+                    <w:jc w:val="right"/>
+                    <w:jc w:val="center"/>
+                  </w:pPr>
+                  <w:r>
+                    <w:t xml:space="preserve">0.11400</w:t>
                   </w:r>
                 </w:p>
               </w:tc>
@@ -2809,46 +2809,46 @@
                     <w:jc w:val="center"/>
                   </w:pPr>
                   <w:r>
-                    <w:t xml:space="preserve">0.02490</w:t>
-                  </w:r>
-                </w:p>
-              </w:tc>
-              <w:tc>
-                <w:tcPr/>
-                <w:p>
-                  <w:pPr>
-                    <w:pStyle w:val="Compact"/>
-                    <w:jc w:val="right"/>
-                    <w:jc w:val="center"/>
-                  </w:pPr>
-                  <w:r>
-                    <w:t xml:space="preserve">0.00710</w:t>
-                  </w:r>
-                </w:p>
-              </w:tc>
-              <w:tc>
-                <w:tcPr/>
-                <w:p>
-                  <w:pPr>
-                    <w:pStyle w:val="Compact"/>
-                    <w:jc w:val="right"/>
-                    <w:jc w:val="center"/>
-                  </w:pPr>
-                  <w:r>
-                    <w:t xml:space="preserve">3.52</w:t>
-                  </w:r>
-                </w:p>
-              </w:tc>
-              <w:tc>
-                <w:tcPr/>
-                <w:p>
-                  <w:pPr>
-                    <w:pStyle w:val="Compact"/>
-                    <w:jc w:val="right"/>
-                    <w:jc w:val="center"/>
-                  </w:pPr>
-                  <w:r>
-                    <w:t xml:space="preserve">0.000439</w:t>
+                    <w:t xml:space="preserve">0.01990</w:t>
+                  </w:r>
+                </w:p>
+              </w:tc>
+              <w:tc>
+                <w:tcPr/>
+                <w:p>
+                  <w:pPr>
+                    <w:pStyle w:val="Compact"/>
+                    <w:jc w:val="right"/>
+                    <w:jc w:val="center"/>
+                  </w:pPr>
+                  <w:r>
+                    <w:t xml:space="preserve">0.00721</w:t>
+                  </w:r>
+                </w:p>
+              </w:tc>
+              <w:tc>
+                <w:tcPr/>
+                <w:p>
+                  <w:pPr>
+                    <w:pStyle w:val="Compact"/>
+                    <w:jc w:val="right"/>
+                    <w:jc w:val="center"/>
+                  </w:pPr>
+                  <w:r>
+                    <w:t xml:space="preserve">2.76</w:t>
+                  </w:r>
+                </w:p>
+              </w:tc>
+              <w:tc>
+                <w:tcPr/>
+                <w:p>
+                  <w:pPr>
+                    <w:pStyle w:val="Compact"/>
+                    <w:jc w:val="right"/>
+                    <w:jc w:val="center"/>
+                  </w:pPr>
+                  <w:r>
+                    <w:t xml:space="preserve">0.00573</w:t>
                   </w:r>
                 </w:p>
               </w:tc>
@@ -2915,46 +2915,46 @@
                     <w:jc w:val="center"/>
                   </w:pPr>
                   <w:r>
-                    <w:t xml:space="preserve">0.01590</w:t>
-                  </w:r>
-                </w:p>
-              </w:tc>
-              <w:tc>
-                <w:tcPr/>
-                <w:p>
-                  <w:pPr>
-                    <w:pStyle w:val="Compact"/>
-                    <w:jc w:val="right"/>
-                    <w:jc w:val="center"/>
-                  </w:pPr>
-                  <w:r>
-                    <w:t xml:space="preserve">0.01010</w:t>
-                  </w:r>
-                </w:p>
-              </w:tc>
-              <w:tc>
-                <w:tcPr/>
-                <w:p>
-                  <w:pPr>
-                    <w:pStyle w:val="Compact"/>
-                    <w:jc w:val="right"/>
-                    <w:jc w:val="center"/>
-                  </w:pPr>
-                  <w:r>
-                    <w:t xml:space="preserve">1.58</w:t>
-                  </w:r>
-                </w:p>
-              </w:tc>
-              <w:tc>
-                <w:tcPr/>
-                <w:p>
-                  <w:pPr>
-                    <w:pStyle w:val="Compact"/>
-                    <w:jc w:val="right"/>
-                    <w:jc w:val="center"/>
-                  </w:pPr>
-                  <w:r>
-                    <w:t xml:space="preserve">0.114000</w:t>
+                    <w:t xml:space="preserve">0.02010</w:t>
+                  </w:r>
+                </w:p>
+              </w:tc>
+              <w:tc>
+                <w:tcPr/>
+                <w:p>
+                  <w:pPr>
+                    <w:pStyle w:val="Compact"/>
+                    <w:jc w:val="right"/>
+                    <w:jc w:val="center"/>
+                  </w:pPr>
+                  <w:r>
+                    <w:t xml:space="preserve">0.00985</w:t>
+                  </w:r>
+                </w:p>
+              </w:tc>
+              <w:tc>
+                <w:tcPr/>
+                <w:p>
+                  <w:pPr>
+                    <w:pStyle w:val="Compact"/>
+                    <w:jc w:val="right"/>
+                    <w:jc w:val="center"/>
+                  </w:pPr>
+                  <w:r>
+                    <w:t xml:space="preserve">2.04</w:t>
+                  </w:r>
+                </w:p>
+              </w:tc>
+              <w:tc>
+                <w:tcPr/>
+                <w:p>
+                  <w:pPr>
+                    <w:pStyle w:val="Compact"/>
+                    <w:jc w:val="right"/>
+                    <w:jc w:val="center"/>
+                  </w:pPr>
+                  <w:r>
+                    <w:t xml:space="preserve">0.04090</w:t>
                   </w:r>
                 </w:p>
               </w:tc>
@@ -3021,46 +3021,46 @@
                     <w:jc w:val="center"/>
                   </w:pPr>
                   <w:r>
-                    <w:t xml:space="preserve">-0.00395</w:t>
-                  </w:r>
-                </w:p>
-              </w:tc>
-              <w:tc>
-                <w:tcPr/>
-                <w:p>
-                  <w:pPr>
-                    <w:pStyle w:val="Compact"/>
-                    <w:jc w:val="right"/>
-                    <w:jc w:val="center"/>
-                  </w:pPr>
-                  <w:r>
-                    <w:t xml:space="preserve">0.00336</w:t>
-                  </w:r>
-                </w:p>
-              </w:tc>
-              <w:tc>
-                <w:tcPr/>
-                <w:p>
-                  <w:pPr>
-                    <w:pStyle w:val="Compact"/>
-                    <w:jc w:val="right"/>
-                    <w:jc w:val="center"/>
-                  </w:pPr>
-                  <w:r>
-                    <w:t xml:space="preserve">-1.18</w:t>
-                  </w:r>
-                </w:p>
-              </w:tc>
-              <w:tc>
-                <w:tcPr/>
-                <w:p>
-                  <w:pPr>
-                    <w:pStyle w:val="Compact"/>
-                    <w:jc w:val="right"/>
-                    <w:jc w:val="center"/>
-                  </w:pPr>
-                  <w:r>
-                    <w:t xml:space="preserve">0.239000</w:t>
+                    <w:t xml:space="preserve">-0.00524</w:t>
+                  </w:r>
+                </w:p>
+              </w:tc>
+              <w:tc>
+                <w:tcPr/>
+                <w:p>
+                  <w:pPr>
+                    <w:pStyle w:val="Compact"/>
+                    <w:jc w:val="right"/>
+                    <w:jc w:val="center"/>
+                  </w:pPr>
+                  <w:r>
+                    <w:t xml:space="preserve">0.00332</w:t>
+                  </w:r>
+                </w:p>
+              </w:tc>
+              <w:tc>
+                <w:tcPr/>
+                <w:p>
+                  <w:pPr>
+                    <w:pStyle w:val="Compact"/>
+                    <w:jc w:val="right"/>
+                    <w:jc w:val="center"/>
+                  </w:pPr>
+                  <w:r>
+                    <w:t xml:space="preserve">-1.58</w:t>
+                  </w:r>
+                </w:p>
+              </w:tc>
+              <w:tc>
+                <w:tcPr/>
+                <w:p>
+                  <w:pPr>
+                    <w:pStyle w:val="Compact"/>
+                    <w:jc w:val="right"/>
+                    <w:jc w:val="center"/>
+                  </w:pPr>
+                  <w:r>
+                    <w:t xml:space="preserve">0.11400</w:t>
                   </w:r>
                 </w:p>
               </w:tc>
@@ -3127,46 +3127,46 @@
                     <w:jc w:val="center"/>
                   </w:pPr>
                   <w:r>
-                    <w:t xml:space="preserve">-0.00832</w:t>
-                  </w:r>
-                </w:p>
-              </w:tc>
-              <w:tc>
-                <w:tcPr/>
-                <w:p>
-                  <w:pPr>
-                    <w:pStyle w:val="Compact"/>
-                    <w:jc w:val="right"/>
-                    <w:jc w:val="center"/>
-                  </w:pPr>
-                  <w:r>
-                    <w:t xml:space="preserve">0.00237</w:t>
-                  </w:r>
-                </w:p>
-              </w:tc>
-              <w:tc>
-                <w:tcPr/>
-                <w:p>
-                  <w:pPr>
-                    <w:pStyle w:val="Compact"/>
-                    <w:jc w:val="right"/>
-                    <w:jc w:val="center"/>
-                  </w:pPr>
-                  <w:r>
-                    <w:t xml:space="preserve">-3.52</w:t>
-                  </w:r>
-                </w:p>
-              </w:tc>
-              <w:tc>
-                <w:tcPr/>
-                <w:p>
-                  <w:pPr>
-                    <w:pStyle w:val="Compact"/>
-                    <w:jc w:val="right"/>
-                    <w:jc w:val="center"/>
-                  </w:pPr>
-                  <w:r>
-                    <w:t xml:space="preserve">0.000439</w:t>
+                    <w:t xml:space="preserve">-0.00664</w:t>
+                  </w:r>
+                </w:p>
+              </w:tc>
+              <w:tc>
+                <w:tcPr/>
+                <w:p>
+                  <w:pPr>
+                    <w:pStyle w:val="Compact"/>
+                    <w:jc w:val="right"/>
+                    <w:jc w:val="center"/>
+                  </w:pPr>
+                  <w:r>
+                    <w:t xml:space="preserve">0.00240</w:t>
+                  </w:r>
+                </w:p>
+              </w:tc>
+              <w:tc>
+                <w:tcPr/>
+                <w:p>
+                  <w:pPr>
+                    <w:pStyle w:val="Compact"/>
+                    <w:jc w:val="right"/>
+                    <w:jc w:val="center"/>
+                  </w:pPr>
+                  <w:r>
+                    <w:t xml:space="preserve">-2.76</w:t>
+                  </w:r>
+                </w:p>
+              </w:tc>
+              <w:tc>
+                <w:tcPr/>
+                <w:p>
+                  <w:pPr>
+                    <w:pStyle w:val="Compact"/>
+                    <w:jc w:val="right"/>
+                    <w:jc w:val="center"/>
+                  </w:pPr>
+                  <w:r>
+                    <w:t xml:space="preserve">0.00573</w:t>
                   </w:r>
                 </w:p>
               </w:tc>
@@ -3233,46 +3233,46 @@
                     <w:jc w:val="center"/>
                   </w:pPr>
                   <w:r>
-                    <w:t xml:space="preserve">-0.00530</w:t>
-                  </w:r>
-                </w:p>
-              </w:tc>
-              <w:tc>
-                <w:tcPr/>
-                <w:p>
-                  <w:pPr>
-                    <w:pStyle w:val="Compact"/>
-                    <w:jc w:val="right"/>
-                    <w:jc w:val="center"/>
-                  </w:pPr>
-                  <w:r>
-                    <w:t xml:space="preserve">0.00335</w:t>
-                  </w:r>
-                </w:p>
-              </w:tc>
-              <w:tc>
-                <w:tcPr/>
-                <w:p>
-                  <w:pPr>
-                    <w:pStyle w:val="Compact"/>
-                    <w:jc w:val="right"/>
-                    <w:jc w:val="center"/>
-                  </w:pPr>
-                  <w:r>
-                    <w:t xml:space="preserve">-1.58</w:t>
-                  </w:r>
-                </w:p>
-              </w:tc>
-              <w:tc>
-                <w:tcPr/>
-                <w:p>
-                  <w:pPr>
-                    <w:pStyle w:val="Compact"/>
-                    <w:jc w:val="right"/>
-                    <w:jc w:val="center"/>
-                  </w:pPr>
-                  <w:r>
-                    <w:t xml:space="preserve">0.114000</w:t>
+                    <w:t xml:space="preserve">-0.00671</w:t>
+                  </w:r>
+                </w:p>
+              </w:tc>
+              <w:tc>
+                <w:tcPr/>
+                <w:p>
+                  <w:pPr>
+                    <w:pStyle w:val="Compact"/>
+                    <w:jc w:val="right"/>
+                    <w:jc w:val="center"/>
+                  </w:pPr>
+                  <w:r>
+                    <w:t xml:space="preserve">0.00328</w:t>
+                  </w:r>
+                </w:p>
+              </w:tc>
+              <w:tc>
+                <w:tcPr/>
+                <w:p>
+                  <w:pPr>
+                    <w:pStyle w:val="Compact"/>
+                    <w:jc w:val="right"/>
+                    <w:jc w:val="center"/>
+                  </w:pPr>
+                  <w:r>
+                    <w:t xml:space="preserve">-2.04</w:t>
+                  </w:r>
+                </w:p>
+              </w:tc>
+              <w:tc>
+                <w:tcPr/>
+                <w:p>
+                  <w:pPr>
+                    <w:pStyle w:val="Compact"/>
+                    <w:jc w:val="right"/>
+                    <w:jc w:val="center"/>
+                  </w:pPr>
+                  <w:r>
+                    <w:t xml:space="preserve">0.04090</w:t>
                   </w:r>
                 </w:p>
               </w:tc>
@@ -3339,46 +3339,46 @@
                     <w:jc w:val="center"/>
                   </w:pPr>
                   <w:r>
-                    <w:t xml:space="preserve">-0.38800</w:t>
-                  </w:r>
-                </w:p>
-              </w:tc>
-              <w:tc>
-                <w:tcPr/>
-                <w:p>
-                  <w:pPr>
-                    <w:pStyle w:val="Compact"/>
-                    <w:jc w:val="right"/>
-                    <w:jc w:val="center"/>
-                  </w:pPr>
-                  <w:r>
-                    <w:t xml:space="preserve">0.41200</w:t>
-                  </w:r>
-                </w:p>
-              </w:tc>
-              <w:tc>
-                <w:tcPr/>
-                <w:p>
-                  <w:pPr>
-                    <w:pStyle w:val="Compact"/>
-                    <w:jc w:val="right"/>
-                    <w:jc w:val="center"/>
-                  </w:pPr>
-                  <w:r>
-                    <w:t xml:space="preserve">-0.94</w:t>
-                  </w:r>
-                </w:p>
-              </w:tc>
-              <w:tc>
-                <w:tcPr/>
-                <w:p>
-                  <w:pPr>
-                    <w:pStyle w:val="Compact"/>
-                    <w:jc w:val="right"/>
-                    <w:jc w:val="center"/>
-                  </w:pPr>
-                  <w:r>
-                    <w:t xml:space="preserve">0.346000</w:t>
+                    <w:t xml:space="preserve">-0.32900</w:t>
+                  </w:r>
+                </w:p>
+              </w:tc>
+              <w:tc>
+                <w:tcPr/>
+                <w:p>
+                  <w:pPr>
+                    <w:pStyle w:val="Compact"/>
+                    <w:jc w:val="right"/>
+                    <w:jc w:val="center"/>
+                  </w:pPr>
+                  <w:r>
+                    <w:t xml:space="preserve">0.29200</w:t>
+                  </w:r>
+                </w:p>
+              </w:tc>
+              <w:tc>
+                <w:tcPr/>
+                <w:p>
+                  <w:pPr>
+                    <w:pStyle w:val="Compact"/>
+                    <w:jc w:val="right"/>
+                    <w:jc w:val="center"/>
+                  </w:pPr>
+                  <w:r>
+                    <w:t xml:space="preserve">-1.13</w:t>
+                  </w:r>
+                </w:p>
+              </w:tc>
+              <w:tc>
+                <w:tcPr/>
+                <w:p>
+                  <w:pPr>
+                    <w:pStyle w:val="Compact"/>
+                    <w:jc w:val="right"/>
+                    <w:jc w:val="center"/>
+                  </w:pPr>
+                  <w:r>
+                    <w:t xml:space="preserve">0.25900</w:t>
                   </w:r>
                 </w:p>
               </w:tc>
@@ -3445,46 +3445,46 @@
                     <w:jc w:val="center"/>
                   </w:pPr>
                   <w:r>
-                    <w:t xml:space="preserve">0.00486</w:t>
-                  </w:r>
-                </w:p>
-              </w:tc>
-              <w:tc>
-                <w:tcPr/>
-                <w:p>
-                  <w:pPr>
-                    <w:pStyle w:val="Compact"/>
-                    <w:jc w:val="right"/>
-                    <w:jc w:val="center"/>
-                  </w:pPr>
-                  <w:r>
-                    <w:t xml:space="preserve">0.01090</w:t>
-                  </w:r>
-                </w:p>
-              </w:tc>
-              <w:tc>
-                <w:tcPr/>
-                <w:p>
-                  <w:pPr>
-                    <w:pStyle w:val="Compact"/>
-                    <w:jc w:val="right"/>
-                    <w:jc w:val="center"/>
-                  </w:pPr>
-                  <w:r>
-                    <w:t xml:space="preserve">0.45</w:t>
-                  </w:r>
-                </w:p>
-              </w:tc>
-              <w:tc>
-                <w:tcPr/>
-                <w:p>
-                  <w:pPr>
-                    <w:pStyle w:val="Compact"/>
-                    <w:jc w:val="right"/>
-                    <w:jc w:val="center"/>
-                  </w:pPr>
-                  <w:r>
-                    <w:t xml:space="preserve">0.654000</w:t>
+                    <w:t xml:space="preserve">0.00574</w:t>
+                  </w:r>
+                </w:p>
+              </w:tc>
+              <w:tc>
+                <w:tcPr/>
+                <w:p>
+                  <w:pPr>
+                    <w:pStyle w:val="Compact"/>
+                    <w:jc w:val="right"/>
+                    <w:jc w:val="center"/>
+                  </w:pPr>
+                  <w:r>
+                    <w:t xml:space="preserve">0.00905</w:t>
+                  </w:r>
+                </w:p>
+              </w:tc>
+              <w:tc>
+                <w:tcPr/>
+                <w:p>
+                  <w:pPr>
+                    <w:pStyle w:val="Compact"/>
+                    <w:jc w:val="right"/>
+                    <w:jc w:val="center"/>
+                  </w:pPr>
+                  <w:r>
+                    <w:t xml:space="preserve">0.63</w:t>
+                  </w:r>
+                </w:p>
+              </w:tc>
+              <w:tc>
+                <w:tcPr/>
+                <w:p>
+                  <w:pPr>
+                    <w:pStyle w:val="Compact"/>
+                    <w:jc w:val="right"/>
+                    <w:jc w:val="center"/>
+                  </w:pPr>
+                  <w:r>
+                    <w:t xml:space="preserve">0.52600</w:t>
                   </w:r>
                 </w:p>
               </w:tc>
@@ -3551,46 +3551,46 @@
                     <w:jc w:val="center"/>
                   </w:pPr>
                   <w:r>
-                    <w:t xml:space="preserve">0.02730</w:t>
-                  </w:r>
-                </w:p>
-              </w:tc>
-              <w:tc>
-                <w:tcPr/>
-                <w:p>
-                  <w:pPr>
-                    <w:pStyle w:val="Compact"/>
-                    <w:jc w:val="right"/>
-                    <w:jc w:val="center"/>
-                  </w:pPr>
-                  <w:r>
-                    <w:t xml:space="preserve">0.01890</w:t>
-                  </w:r>
-                </w:p>
-              </w:tc>
-              <w:tc>
-                <w:tcPr/>
-                <w:p>
-                  <w:pPr>
-                    <w:pStyle w:val="Compact"/>
-                    <w:jc w:val="right"/>
-                    <w:jc w:val="center"/>
-                  </w:pPr>
-                  <w:r>
-                    <w:t xml:space="preserve">1.44</w:t>
-                  </w:r>
-                </w:p>
-              </w:tc>
-              <w:tc>
-                <w:tcPr/>
-                <w:p>
-                  <w:pPr>
-                    <w:pStyle w:val="Compact"/>
-                    <w:jc w:val="right"/>
-                    <w:jc w:val="center"/>
-                  </w:pPr>
-                  <w:r>
-                    <w:t xml:space="preserve">0.150000</w:t>
+                    <w:t xml:space="preserve">0.02570</w:t>
+                  </w:r>
+                </w:p>
+              </w:tc>
+              <w:tc>
+                <w:tcPr/>
+                <w:p>
+                  <w:pPr>
+                    <w:pStyle w:val="Compact"/>
+                    <w:jc w:val="right"/>
+                    <w:jc w:val="center"/>
+                  </w:pPr>
+                  <w:r>
+                    <w:t xml:space="preserve">0.01450</w:t>
+                  </w:r>
+                </w:p>
+              </w:tc>
+              <w:tc>
+                <w:tcPr/>
+                <w:p>
+                  <w:pPr>
+                    <w:pStyle w:val="Compact"/>
+                    <w:jc w:val="right"/>
+                    <w:jc w:val="center"/>
+                  </w:pPr>
+                  <w:r>
+                    <w:t xml:space="preserve">1.77</w:t>
+                  </w:r>
+                </w:p>
+              </w:tc>
+              <w:tc>
+                <w:tcPr/>
+                <w:p>
+                  <w:pPr>
+                    <w:pStyle w:val="Compact"/>
+                    <w:jc w:val="right"/>
+                    <w:jc w:val="center"/>
+                  </w:pPr>
+                  <w:r>
+                    <w:t xml:space="preserve">0.07680</w:t>
                   </w:r>
                 </w:p>
               </w:tc>
@@ -3657,46 +3657,46 @@
                     <w:jc w:val="center"/>
                   </w:pPr>
                   <w:r>
-                    <w:t xml:space="preserve">-0.00909</w:t>
-                  </w:r>
-                </w:p>
-              </w:tc>
-              <w:tc>
-                <w:tcPr/>
-                <w:p>
-                  <w:pPr>
-                    <w:pStyle w:val="Compact"/>
-                    <w:jc w:val="right"/>
-                    <w:jc w:val="center"/>
-                  </w:pPr>
-                  <w:r>
-                    <w:t xml:space="preserve">0.00631</w:t>
-                  </w:r>
-                </w:p>
-              </w:tc>
-              <w:tc>
-                <w:tcPr/>
-                <w:p>
-                  <w:pPr>
-                    <w:pStyle w:val="Compact"/>
-                    <w:jc w:val="right"/>
-                    <w:jc w:val="center"/>
-                  </w:pPr>
-                  <w:r>
-                    <w:t xml:space="preserve">-1.44</w:t>
-                  </w:r>
-                </w:p>
-              </w:tc>
-              <w:tc>
-                <w:tcPr/>
-                <w:p>
-                  <w:pPr>
-                    <w:pStyle w:val="Compact"/>
-                    <w:jc w:val="right"/>
-                    <w:jc w:val="center"/>
-                  </w:pPr>
-                  <w:r>
-                    <w:t xml:space="preserve">0.150000</w:t>
+                    <w:t xml:space="preserve">-0.00858</w:t>
+                  </w:r>
+                </w:p>
+              </w:tc>
+              <w:tc>
+                <w:tcPr/>
+                <w:p>
+                  <w:pPr>
+                    <w:pStyle w:val="Compact"/>
+                    <w:jc w:val="right"/>
+                    <w:jc w:val="center"/>
+                  </w:pPr>
+                  <w:r>
+                    <w:t xml:space="preserve">0.00485</w:t>
+                  </w:r>
+                </w:p>
+              </w:tc>
+              <w:tc>
+                <w:tcPr/>
+                <w:p>
+                  <w:pPr>
+                    <w:pStyle w:val="Compact"/>
+                    <w:jc w:val="right"/>
+                    <w:jc w:val="center"/>
+                  </w:pPr>
+                  <w:r>
+                    <w:t xml:space="preserve">-1.77</w:t>
+                  </w:r>
+                </w:p>
+              </w:tc>
+              <w:tc>
+                <w:tcPr/>
+                <w:p>
+                  <w:pPr>
+                    <w:pStyle w:val="Compact"/>
+                    <w:jc w:val="right"/>
+                    <w:jc w:val="center"/>
+                  </w:pPr>
+                  <w:r>
+                    <w:t xml:space="preserve">0.07680</w:t>
                   </w:r>
                 </w:p>
               </w:tc>
@@ -3763,59 +3763,59 @@
                     <w:jc w:val="center"/>
                   </w:pPr>
                   <w:r>
-                    <w:t xml:space="preserve">0.08680</w:t>
-                  </w:r>
-                </w:p>
-              </w:tc>
-              <w:tc>
-                <w:tcPr/>
-                <w:p>
-                  <w:pPr>
-                    <w:pStyle w:val="Compact"/>
-                    <w:jc w:val="right"/>
-                    <w:jc w:val="center"/>
-                  </w:pPr>
-                  <w:r>
-                    <w:t xml:space="preserve">0.20000</w:t>
-                  </w:r>
-                </w:p>
-              </w:tc>
-              <w:tc>
-                <w:tcPr/>
-                <w:p>
-                  <w:pPr>
-                    <w:pStyle w:val="Compact"/>
-                    <w:jc w:val="right"/>
-                    <w:jc w:val="center"/>
-                  </w:pPr>
-                  <w:r>
-                    <w:t xml:space="preserve">0.44</w:t>
-                  </w:r>
-                </w:p>
-              </w:tc>
-              <w:tc>
-                <w:tcPr/>
-                <w:p>
-                  <w:pPr>
-                    <w:pStyle w:val="Compact"/>
-                    <w:jc w:val="right"/>
-                    <w:jc w:val="center"/>
-                  </w:pPr>
-                  <w:r>
-                    <w:t xml:space="preserve">0.663000</w:t>
-                  </w:r>
-                </w:p>
-              </w:tc>
-              <w:tc>
-                <w:tcPr/>
-                <w:p>
-                  <w:pPr>
-                    <w:pStyle w:val="Compact"/>
-                    <w:jc w:val="right"/>
-                    <w:jc w:val="center"/>
-                  </w:pPr>
-                  <w:r>
-                    <w:t xml:space="preserve">49</w:t>
+                    <w:t xml:space="preserve">0.01040</w:t>
+                  </w:r>
+                </w:p>
+              </w:tc>
+              <w:tc>
+                <w:tcPr/>
+                <w:p>
+                  <w:pPr>
+                    <w:pStyle w:val="Compact"/>
+                    <w:jc w:val="right"/>
+                    <w:jc w:val="center"/>
+                  </w:pPr>
+                  <w:r>
+                    <w:t xml:space="preserve">0.19400</w:t>
+                  </w:r>
+                </w:p>
+              </w:tc>
+              <w:tc>
+                <w:tcPr/>
+                <w:p>
+                  <w:pPr>
+                    <w:pStyle w:val="Compact"/>
+                    <w:jc w:val="right"/>
+                    <w:jc w:val="center"/>
+                  </w:pPr>
+                  <w:r>
+                    <w:t xml:space="preserve">0.05</w:t>
+                  </w:r>
+                </w:p>
+              </w:tc>
+              <w:tc>
+                <w:tcPr/>
+                <w:p>
+                  <w:pPr>
+                    <w:pStyle w:val="Compact"/>
+                    <w:jc w:val="right"/>
+                    <w:jc w:val="center"/>
+                  </w:pPr>
+                  <w:r>
+                    <w:t xml:space="preserve">0.95700</w:t>
+                  </w:r>
+                </w:p>
+              </w:tc>
+              <w:tc>
+                <w:tcPr/>
+                <w:p>
+                  <w:pPr>
+                    <w:pStyle w:val="Compact"/>
+                    <w:jc w:val="right"/>
+                    <w:jc w:val="center"/>
+                  </w:pPr>
+                  <w:r>
+                    <w:t xml:space="preserve">50</w:t>
                   </w:r>
                 </w:p>
               </w:tc>
@@ -3869,46 +3869,46 @@
                     <w:jc w:val="center"/>
                   </w:pPr>
                   <w:r>
-                    <w:t xml:space="preserve">0.23100</w:t>
-                  </w:r>
-                </w:p>
-              </w:tc>
-              <w:tc>
-                <w:tcPr/>
-                <w:p>
-                  <w:pPr>
-                    <w:pStyle w:val="Compact"/>
-                    <w:jc w:val="right"/>
-                    <w:jc w:val="center"/>
-                  </w:pPr>
-                  <w:r>
-                    <w:t xml:space="preserve">0.19900</w:t>
-                  </w:r>
-                </w:p>
-              </w:tc>
-              <w:tc>
-                <w:tcPr/>
-                <w:p>
-                  <w:pPr>
-                    <w:pStyle w:val="Compact"/>
-                    <w:jc w:val="right"/>
-                    <w:jc w:val="center"/>
-                  </w:pPr>
-                  <w:r>
-                    <w:t xml:space="preserve">1.16</w:t>
-                  </w:r>
-                </w:p>
-              </w:tc>
-              <w:tc>
-                <w:tcPr/>
-                <w:p>
-                  <w:pPr>
-                    <w:pStyle w:val="Compact"/>
-                    <w:jc w:val="right"/>
-                    <w:jc w:val="center"/>
-                  </w:pPr>
-                  <w:r>
-                    <w:t xml:space="preserve">0.246000</w:t>
+                    <w:t xml:space="preserve">0.11200</w:t>
+                  </w:r>
+                </w:p>
+              </w:tc>
+              <w:tc>
+                <w:tcPr/>
+                <w:p>
+                  <w:pPr>
+                    <w:pStyle w:val="Compact"/>
+                    <w:jc w:val="right"/>
+                    <w:jc w:val="center"/>
+                  </w:pPr>
+                  <w:r>
+                    <w:t xml:space="preserve">0.19600</w:t>
+                  </w:r>
+                </w:p>
+              </w:tc>
+              <w:tc>
+                <w:tcPr/>
+                <w:p>
+                  <w:pPr>
+                    <w:pStyle w:val="Compact"/>
+                    <w:jc w:val="right"/>
+                    <w:jc w:val="center"/>
+                  </w:pPr>
+                  <w:r>
+                    <w:t xml:space="preserve">0.57</w:t>
+                  </w:r>
+                </w:p>
+              </w:tc>
+              <w:tc>
+                <w:tcPr/>
+                <w:p>
+                  <w:pPr>
+                    <w:pStyle w:val="Compact"/>
+                    <w:jc w:val="right"/>
+                    <w:jc w:val="center"/>
+                  </w:pPr>
+                  <w:r>
+                    <w:t xml:space="preserve">0.56800</w:t>
                   </w:r>
                 </w:p>
               </w:tc>
@@ -3975,46 +3975,46 @@
                     <w:jc w:val="center"/>
                   </w:pPr>
                   <w:r>
-                    <w:t xml:space="preserve">-0.68200</w:t>
-                  </w:r>
-                </w:p>
-              </w:tc>
-              <w:tc>
-                <w:tcPr/>
-                <w:p>
-                  <w:pPr>
-                    <w:pStyle w:val="Compact"/>
-                    <w:jc w:val="right"/>
-                    <w:jc w:val="center"/>
-                  </w:pPr>
-                  <w:r>
-                    <w:t xml:space="preserve">0.20900</w:t>
-                  </w:r>
-                </w:p>
-              </w:tc>
-              <w:tc>
-                <w:tcPr/>
-                <w:p>
-                  <w:pPr>
-                    <w:pStyle w:val="Compact"/>
-                    <w:jc w:val="right"/>
-                    <w:jc w:val="center"/>
-                  </w:pPr>
-                  <w:r>
-                    <w:t xml:space="preserve">-3.27</w:t>
-                  </w:r>
-                </w:p>
-              </w:tc>
-              <w:tc>
-                <w:tcPr/>
-                <w:p>
-                  <w:pPr>
-                    <w:pStyle w:val="Compact"/>
-                    <w:jc w:val="right"/>
-                    <w:jc w:val="center"/>
-                  </w:pPr>
-                  <w:r>
-                    <w:t xml:space="preserve">0.001090</w:t>
+                    <w:t xml:space="preserve">-0.29400</w:t>
+                  </w:r>
+                </w:p>
+              </w:tc>
+              <w:tc>
+                <w:tcPr/>
+                <w:p>
+                  <w:pPr>
+                    <w:pStyle w:val="Compact"/>
+                    <w:jc w:val="right"/>
+                    <w:jc w:val="center"/>
+                  </w:pPr>
+                  <w:r>
+                    <w:t xml:space="preserve">0.20800</w:t>
+                  </w:r>
+                </w:p>
+              </w:tc>
+              <w:tc>
+                <w:tcPr/>
+                <w:p>
+                  <w:pPr>
+                    <w:pStyle w:val="Compact"/>
+                    <w:jc w:val="right"/>
+                    <w:jc w:val="center"/>
+                  </w:pPr>
+                  <w:r>
+                    <w:t xml:space="preserve">-1.41</w:t>
+                  </w:r>
+                </w:p>
+              </w:tc>
+              <w:tc>
+                <w:tcPr/>
+                <w:p>
+                  <w:pPr>
+                    <w:pStyle w:val="Compact"/>
+                    <w:jc w:val="right"/>
+                    <w:jc w:val="center"/>
+                  </w:pPr>
+                  <w:r>
+                    <w:t xml:space="preserve">0.15700</w:t>
                   </w:r>
                 </w:p>
               </w:tc>
@@ -4081,59 +4081,59 @@
                     <w:jc w:val="center"/>
                   </w:pPr>
                   <w:r>
-                    <w:t xml:space="preserve">0.00475</w:t>
-                  </w:r>
-                </w:p>
-              </w:tc>
-              <w:tc>
-                <w:tcPr/>
-                <w:p>
-                  <w:pPr>
-                    <w:pStyle w:val="Compact"/>
-                    <w:jc w:val="right"/>
-                    <w:jc w:val="center"/>
-                  </w:pPr>
-                  <w:r>
-                    <w:t xml:space="preserve">0.00686</w:t>
-                  </w:r>
-                </w:p>
-              </w:tc>
-              <w:tc>
-                <w:tcPr/>
-                <w:p>
-                  <w:pPr>
-                    <w:pStyle w:val="Compact"/>
-                    <w:jc w:val="right"/>
-                    <w:jc w:val="center"/>
-                  </w:pPr>
-                  <w:r>
-                    <w:t xml:space="preserve">0.69</w:t>
-                  </w:r>
-                </w:p>
-              </w:tc>
-              <w:tc>
-                <w:tcPr/>
-                <w:p>
-                  <w:pPr>
-                    <w:pStyle w:val="Compact"/>
-                    <w:jc w:val="right"/>
-                    <w:jc w:val="center"/>
-                  </w:pPr>
-                  <w:r>
-                    <w:t xml:space="preserve">0.489000</w:t>
-                  </w:r>
-                </w:p>
-              </w:tc>
-              <w:tc>
-                <w:tcPr/>
-                <w:p>
-                  <w:pPr>
-                    <w:pStyle w:val="Compact"/>
-                    <w:jc w:val="right"/>
-                    <w:jc w:val="center"/>
-                  </w:pPr>
-                  <w:r>
-                    <w:t xml:space="preserve">50</w:t>
+                    <w:t xml:space="preserve">0.00485</w:t>
+                  </w:r>
+                </w:p>
+              </w:tc>
+              <w:tc>
+                <w:tcPr/>
+                <w:p>
+                  <w:pPr>
+                    <w:pStyle w:val="Compact"/>
+                    <w:jc w:val="right"/>
+                    <w:jc w:val="center"/>
+                  </w:pPr>
+                  <w:r>
+                    <w:t xml:space="preserve">0.00680</w:t>
+                  </w:r>
+                </w:p>
+              </w:tc>
+              <w:tc>
+                <w:tcPr/>
+                <w:p>
+                  <w:pPr>
+                    <w:pStyle w:val="Compact"/>
+                    <w:jc w:val="right"/>
+                    <w:jc w:val="center"/>
+                  </w:pPr>
+                  <w:r>
+                    <w:t xml:space="preserve">0.71</w:t>
+                  </w:r>
+                </w:p>
+              </w:tc>
+              <w:tc>
+                <w:tcPr/>
+                <w:p>
+                  <w:pPr>
+                    <w:pStyle w:val="Compact"/>
+                    <w:jc w:val="right"/>
+                    <w:jc w:val="center"/>
+                  </w:pPr>
+                  <w:r>
+                    <w:t xml:space="preserve">0.47600</w:t>
+                  </w:r>
+                </w:p>
+              </w:tc>
+              <w:tc>
+                <w:tcPr/>
+                <w:p>
+                  <w:pPr>
+                    <w:pStyle w:val="Compact"/>
+                    <w:jc w:val="right"/>
+                    <w:jc w:val="center"/>
+                  </w:pPr>
+                  <w:r>
+                    <w:t xml:space="preserve">38</w:t>
                   </w:r>
                 </w:p>
               </w:tc>
@@ -4187,46 +4187,46 @@
                     <w:jc w:val="center"/>
                   </w:pPr>
                   <w:r>
-                    <w:t xml:space="preserve">0.00567</w:t>
-                  </w:r>
-                </w:p>
-              </w:tc>
-              <w:tc>
-                <w:tcPr/>
-                <w:p>
-                  <w:pPr>
-                    <w:pStyle w:val="Compact"/>
-                    <w:jc w:val="right"/>
-                    <w:jc w:val="center"/>
-                  </w:pPr>
-                  <w:r>
-                    <w:t xml:space="preserve">0.00690</w:t>
-                  </w:r>
-                </w:p>
-              </w:tc>
-              <w:tc>
-                <w:tcPr/>
-                <w:p>
-                  <w:pPr>
-                    <w:pStyle w:val="Compact"/>
-                    <w:jc w:val="right"/>
-                    <w:jc w:val="center"/>
-                  </w:pPr>
-                  <w:r>
-                    <w:t xml:space="preserve">0.82</w:t>
-                  </w:r>
-                </w:p>
-              </w:tc>
-              <w:tc>
-                <w:tcPr/>
-                <w:p>
-                  <w:pPr>
-                    <w:pStyle w:val="Compact"/>
-                    <w:jc w:val="right"/>
-                    <w:jc w:val="center"/>
-                  </w:pPr>
-                  <w:r>
-                    <w:t xml:space="preserve">0.412000</w:t>
+                    <w:t xml:space="preserve">0.00596</w:t>
+                  </w:r>
+                </w:p>
+              </w:tc>
+              <w:tc>
+                <w:tcPr/>
+                <w:p>
+                  <w:pPr>
+                    <w:pStyle w:val="Compact"/>
+                    <w:jc w:val="right"/>
+                    <w:jc w:val="center"/>
+                  </w:pPr>
+                  <w:r>
+                    <w:t xml:space="preserve">0.00686</w:t>
+                  </w:r>
+                </w:p>
+              </w:tc>
+              <w:tc>
+                <w:tcPr/>
+                <w:p>
+                  <w:pPr>
+                    <w:pStyle w:val="Compact"/>
+                    <w:jc w:val="right"/>
+                    <w:jc w:val="center"/>
+                  </w:pPr>
+                  <w:r>
+                    <w:t xml:space="preserve">0.87</w:t>
+                  </w:r>
+                </w:p>
+              </w:tc>
+              <w:tc>
+                <w:tcPr/>
+                <w:p>
+                  <w:pPr>
+                    <w:pStyle w:val="Compact"/>
+                    <w:jc w:val="right"/>
+                    <w:jc w:val="center"/>
+                  </w:pPr>
+                  <w:r>
+                    <w:t xml:space="preserve">0.38500</w:t>
                   </w:r>
                 </w:p>
               </w:tc>
@@ -4293,46 +4293,46 @@
                     <w:jc w:val="center"/>
                   </w:pPr>
                   <w:r>
-                    <w:t xml:space="preserve">-0.00120</w:t>
-                  </w:r>
-                </w:p>
-              </w:tc>
-              <w:tc>
-                <w:tcPr/>
-                <w:p>
-                  <w:pPr>
-                    <w:pStyle w:val="Compact"/>
-                    <w:jc w:val="right"/>
-                    <w:jc w:val="center"/>
-                  </w:pPr>
-                  <w:r>
-                    <w:t xml:space="preserve">0.00349</w:t>
-                  </w:r>
-                </w:p>
-              </w:tc>
-              <w:tc>
-                <w:tcPr/>
-                <w:p>
-                  <w:pPr>
-                    <w:pStyle w:val="Compact"/>
-                    <w:jc w:val="right"/>
-                    <w:jc w:val="center"/>
-                  </w:pPr>
-                  <w:r>
-                    <w:t xml:space="preserve">-0.35</w:t>
-                  </w:r>
-                </w:p>
-              </w:tc>
-              <w:tc>
-                <w:tcPr/>
-                <w:p>
-                  <w:pPr>
-                    <w:pStyle w:val="Compact"/>
-                    <w:jc w:val="right"/>
-                    <w:jc w:val="center"/>
-                  </w:pPr>
-                  <w:r>
-                    <w:t xml:space="preserve">0.730000</w:t>
+                    <w:t xml:space="preserve">-0.00179</w:t>
+                  </w:r>
+                </w:p>
+              </w:tc>
+              <w:tc>
+                <w:tcPr/>
+                <w:p>
+                  <w:pPr>
+                    <w:pStyle w:val="Compact"/>
+                    <w:jc w:val="right"/>
+                    <w:jc w:val="center"/>
+                  </w:pPr>
+                  <w:r>
+                    <w:t xml:space="preserve">0.00441</w:t>
+                  </w:r>
+                </w:p>
+              </w:tc>
+              <w:tc>
+                <w:tcPr/>
+                <w:p>
+                  <w:pPr>
+                    <w:pStyle w:val="Compact"/>
+                    <w:jc w:val="right"/>
+                    <w:jc w:val="center"/>
+                  </w:pPr>
+                  <w:r>
+                    <w:t xml:space="preserve">-0.41</w:t>
+                  </w:r>
+                </w:p>
+              </w:tc>
+              <w:tc>
+                <w:tcPr/>
+                <w:p>
+                  <w:pPr>
+                    <w:pStyle w:val="Compact"/>
+                    <w:jc w:val="right"/>
+                    <w:jc w:val="center"/>
+                  </w:pPr>
+                  <w:r>
+                    <w:t xml:space="preserve">0.68500</w:t>
                   </w:r>
                 </w:p>
               </w:tc>
@@ -4399,59 +4399,59 @@
                     <w:jc w:val="center"/>
                   </w:pPr>
                   <w:r>
-                    <w:t xml:space="preserve">0.00929</w:t>
-                  </w:r>
-                </w:p>
-              </w:tc>
-              <w:tc>
-                <w:tcPr/>
-                <w:p>
-                  <w:pPr>
-                    <w:pStyle w:val="Compact"/>
-                    <w:jc w:val="right"/>
-                    <w:jc w:val="center"/>
-                  </w:pPr>
-                  <w:r>
-                    <w:t xml:space="preserve">0.01010</w:t>
-                  </w:r>
-                </w:p>
-              </w:tc>
-              <w:tc>
-                <w:tcPr/>
-                <w:p>
-                  <w:pPr>
-                    <w:pStyle w:val="Compact"/>
-                    <w:jc w:val="right"/>
-                    <w:jc w:val="center"/>
-                  </w:pPr>
-                  <w:r>
-                    <w:t xml:space="preserve">0.92</w:t>
-                  </w:r>
-                </w:p>
-              </w:tc>
-              <w:tc>
-                <w:tcPr/>
-                <w:p>
-                  <w:pPr>
-                    <w:pStyle w:val="Compact"/>
-                    <w:jc w:val="right"/>
-                    <w:jc w:val="center"/>
-                  </w:pPr>
-                  <w:r>
-                    <w:t xml:space="preserve">0.359000</w:t>
-                  </w:r>
-                </w:p>
-              </w:tc>
-              <w:tc>
-                <w:tcPr/>
-                <w:p>
-                  <w:pPr>
-                    <w:pStyle w:val="Compact"/>
-                    <w:jc w:val="right"/>
-                    <w:jc w:val="center"/>
-                  </w:pPr>
-                  <w:r>
-                    <w:t xml:space="preserve">49</w:t>
+                    <w:t xml:space="preserve">0.01170</w:t>
+                  </w:r>
+                </w:p>
+              </w:tc>
+              <w:tc>
+                <w:tcPr/>
+                <w:p>
+                  <w:pPr>
+                    <w:pStyle w:val="Compact"/>
+                    <w:jc w:val="right"/>
+                    <w:jc w:val="center"/>
+                  </w:pPr>
+                  <w:r>
+                    <w:t xml:space="preserve">0.00993</w:t>
+                  </w:r>
+                </w:p>
+              </w:tc>
+              <w:tc>
+                <w:tcPr/>
+                <w:p>
+                  <w:pPr>
+                    <w:pStyle w:val="Compact"/>
+                    <w:jc w:val="right"/>
+                    <w:jc w:val="center"/>
+                  </w:pPr>
+                  <w:r>
+                    <w:t xml:space="preserve">1.18</w:t>
+                  </w:r>
+                </w:p>
+              </w:tc>
+              <w:tc>
+                <w:tcPr/>
+                <w:p>
+                  <w:pPr>
+                    <w:pStyle w:val="Compact"/>
+                    <w:jc w:val="right"/>
+                    <w:jc w:val="center"/>
+                  </w:pPr>
+                  <w:r>
+                    <w:t xml:space="preserve">0.23900</w:t>
+                  </w:r>
+                </w:p>
+              </w:tc>
+              <w:tc>
+                <w:tcPr/>
+                <w:p>
+                  <w:pPr>
+                    <w:pStyle w:val="Compact"/>
+                    <w:jc w:val="right"/>
+                    <w:jc w:val="center"/>
+                  </w:pPr>
+                  <w:r>
+                    <w:t xml:space="preserve">48</w:t>
                   </w:r>
                 </w:p>
               </w:tc>
@@ -4505,46 +4505,46 @@
                     <w:jc w:val="center"/>
                   </w:pPr>
                   <w:r>
-                    <w:t xml:space="preserve">0.00465</w:t>
-                  </w:r>
-                </w:p>
-              </w:tc>
-              <w:tc>
-                <w:tcPr/>
-                <w:p>
-                  <w:pPr>
-                    <w:pStyle w:val="Compact"/>
-                    <w:jc w:val="right"/>
-                    <w:jc w:val="center"/>
-                  </w:pPr>
-                  <w:r>
-                    <w:t xml:space="preserve">0.01020</w:t>
-                  </w:r>
-                </w:p>
-              </w:tc>
-              <w:tc>
-                <w:tcPr/>
-                <w:p>
-                  <w:pPr>
-                    <w:pStyle w:val="Compact"/>
-                    <w:jc w:val="right"/>
-                    <w:jc w:val="center"/>
-                  </w:pPr>
-                  <w:r>
-                    <w:t xml:space="preserve">0.46</w:t>
-                  </w:r>
-                </w:p>
-              </w:tc>
-              <w:tc>
-                <w:tcPr/>
-                <w:p>
-                  <w:pPr>
-                    <w:pStyle w:val="Compact"/>
-                    <w:jc w:val="right"/>
-                    <w:jc w:val="center"/>
-                  </w:pPr>
-                  <w:r>
-                    <w:t xml:space="preserve">0.648000</w:t>
+                    <w:t xml:space="preserve">0.00945</w:t>
+                  </w:r>
+                </w:p>
+              </w:tc>
+              <w:tc>
+                <w:tcPr/>
+                <w:p>
+                  <w:pPr>
+                    <w:pStyle w:val="Compact"/>
+                    <w:jc w:val="right"/>
+                    <w:jc w:val="center"/>
+                  </w:pPr>
+                  <w:r>
+                    <w:t xml:space="preserve">0.01010</w:t>
+                  </w:r>
+                </w:p>
+              </w:tc>
+              <w:tc>
+                <w:tcPr/>
+                <w:p>
+                  <w:pPr>
+                    <w:pStyle w:val="Compact"/>
+                    <w:jc w:val="right"/>
+                    <w:jc w:val="center"/>
+                  </w:pPr>
+                  <w:r>
+                    <w:t xml:space="preserve">0.94</w:t>
+                  </w:r>
+                </w:p>
+              </w:tc>
+              <w:tc>
+                <w:tcPr/>
+                <w:p>
+                  <w:pPr>
+                    <w:pStyle w:val="Compact"/>
+                    <w:jc w:val="right"/>
+                    <w:jc w:val="center"/>
+                  </w:pPr>
+                  <w:r>
+                    <w:t xml:space="preserve">0.34700</w:t>
                   </w:r>
                 </w:p>
               </w:tc>
@@ -4611,46 +4611,46 @@
                     <w:jc w:val="center"/>
                   </w:pPr>
                   <w:r>
-                    <w:t xml:space="preserve">0.02520</w:t>
-                  </w:r>
-                </w:p>
-              </w:tc>
-              <w:tc>
-                <w:tcPr/>
-                <w:p>
-                  <w:pPr>
-                    <w:pStyle w:val="Compact"/>
-                    <w:jc w:val="right"/>
-                    <w:jc w:val="center"/>
-                  </w:pPr>
-                  <w:r>
-                    <w:t xml:space="preserve">0.00691</w:t>
-                  </w:r>
-                </w:p>
-              </w:tc>
-              <w:tc>
-                <w:tcPr/>
-                <w:p>
-                  <w:pPr>
-                    <w:pStyle w:val="Compact"/>
-                    <w:jc w:val="right"/>
-                    <w:jc w:val="center"/>
-                  </w:pPr>
-                  <w:r>
-                    <w:t xml:space="preserve">3.65</w:t>
-                  </w:r>
-                </w:p>
-              </w:tc>
-              <w:tc>
-                <w:tcPr/>
-                <w:p>
-                  <w:pPr>
-                    <w:pStyle w:val="Compact"/>
-                    <w:jc w:val="right"/>
-                    <w:jc w:val="center"/>
-                  </w:pPr>
-                  <w:r>
-                    <w:t xml:space="preserve">0.000265</w:t>
+                    <w:t xml:space="preserve">0.01120</w:t>
+                  </w:r>
+                </w:p>
+              </w:tc>
+              <w:tc>
+                <w:tcPr/>
+                <w:p>
+                  <w:pPr>
+                    <w:pStyle w:val="Compact"/>
+                    <w:jc w:val="right"/>
+                    <w:jc w:val="center"/>
+                  </w:pPr>
+                  <w:r>
+                    <w:t xml:space="preserve">0.00696</w:t>
+                  </w:r>
+                </w:p>
+              </w:tc>
+              <w:tc>
+                <w:tcPr/>
+                <w:p>
+                  <w:pPr>
+                    <w:pStyle w:val="Compact"/>
+                    <w:jc w:val="right"/>
+                    <w:jc w:val="center"/>
+                  </w:pPr>
+                  <w:r>
+                    <w:t xml:space="preserve">1.60</w:t>
+                  </w:r>
+                </w:p>
+              </w:tc>
+              <w:tc>
+                <w:tcPr/>
+                <w:p>
+                  <w:pPr>
+                    <w:pStyle w:val="Compact"/>
+                    <w:jc w:val="right"/>
+                    <w:jc w:val="center"/>
+                  </w:pPr>
+                  <w:r>
+                    <w:t xml:space="preserve">0.10900</w:t>
                   </w:r>
                 </w:p>
               </w:tc>
@@ -4717,59 +4717,59 @@
                     <w:jc w:val="center"/>
                   </w:pPr>
                   <w:r>
-                    <w:t xml:space="preserve">-0.00310</w:t>
-                  </w:r>
-                </w:p>
-              </w:tc>
-              <w:tc>
-                <w:tcPr/>
-                <w:p>
-                  <w:pPr>
-                    <w:pStyle w:val="Compact"/>
-                    <w:jc w:val="right"/>
-                    <w:jc w:val="center"/>
-                  </w:pPr>
-                  <w:r>
-                    <w:t xml:space="preserve">0.00338</w:t>
-                  </w:r>
-                </w:p>
-              </w:tc>
-              <w:tc>
-                <w:tcPr/>
-                <w:p>
-                  <w:pPr>
-                    <w:pStyle w:val="Compact"/>
-                    <w:jc w:val="right"/>
-                    <w:jc w:val="center"/>
-                  </w:pPr>
-                  <w:r>
-                    <w:t xml:space="preserve">-0.92</w:t>
-                  </w:r>
-                </w:p>
-              </w:tc>
-              <w:tc>
-                <w:tcPr/>
-                <w:p>
-                  <w:pPr>
-                    <w:pStyle w:val="Compact"/>
-                    <w:jc w:val="right"/>
-                    <w:jc w:val="center"/>
-                  </w:pPr>
-                  <w:r>
-                    <w:t xml:space="preserve">0.359000</w:t>
-                  </w:r>
-                </w:p>
-              </w:tc>
-              <w:tc>
-                <w:tcPr/>
-                <w:p>
-                  <w:pPr>
-                    <w:pStyle w:val="Compact"/>
-                    <w:jc w:val="right"/>
-                    <w:jc w:val="center"/>
-                  </w:pPr>
-                  <w:r>
-                    <w:t xml:space="preserve">48</w:t>
+                    <w:t xml:space="preserve">-0.00390</w:t>
+                  </w:r>
+                </w:p>
+              </w:tc>
+              <w:tc>
+                <w:tcPr/>
+                <w:p>
+                  <w:pPr>
+                    <w:pStyle w:val="Compact"/>
+                    <w:jc w:val="right"/>
+                    <w:jc w:val="center"/>
+                  </w:pPr>
+                  <w:r>
+                    <w:t xml:space="preserve">0.00331</w:t>
+                  </w:r>
+                </w:p>
+              </w:tc>
+              <w:tc>
+                <w:tcPr/>
+                <w:p>
+                  <w:pPr>
+                    <w:pStyle w:val="Compact"/>
+                    <w:jc w:val="right"/>
+                    <w:jc w:val="center"/>
+                  </w:pPr>
+                  <w:r>
+                    <w:t xml:space="preserve">-1.18</w:t>
+                  </w:r>
+                </w:p>
+              </w:tc>
+              <w:tc>
+                <w:tcPr/>
+                <w:p>
+                  <w:pPr>
+                    <w:pStyle w:val="Compact"/>
+                    <w:jc w:val="right"/>
+                    <w:jc w:val="center"/>
+                  </w:pPr>
+                  <w:r>
+                    <w:t xml:space="preserve">0.23900</w:t>
+                  </w:r>
+                </w:p>
+              </w:tc>
+              <w:tc>
+                <w:tcPr/>
+                <w:p>
+                  <w:pPr>
+                    <w:pStyle w:val="Compact"/>
+                    <w:jc w:val="right"/>
+                    <w:jc w:val="center"/>
+                  </w:pPr>
+                  <w:r>
+                    <w:t xml:space="preserve">47</w:t>
                   </w:r>
                 </w:p>
               </w:tc>
@@ -4823,46 +4823,46 @@
                     <w:jc w:val="center"/>
                   </w:pPr>
                   <w:r>
-                    <w:t xml:space="preserve">-0.00155</w:t>
-                  </w:r>
-                </w:p>
-              </w:tc>
-              <w:tc>
-                <w:tcPr/>
-                <w:p>
-                  <w:pPr>
-                    <w:pStyle w:val="Compact"/>
-                    <w:jc w:val="right"/>
-                    <w:jc w:val="center"/>
-                  </w:pPr>
-                  <w:r>
-                    <w:t xml:space="preserve">0.00339</w:t>
-                  </w:r>
-                </w:p>
-              </w:tc>
-              <w:tc>
-                <w:tcPr/>
-                <w:p>
-                  <w:pPr>
-                    <w:pStyle w:val="Compact"/>
-                    <w:jc w:val="right"/>
-                    <w:jc w:val="center"/>
-                  </w:pPr>
-                  <w:r>
-                    <w:t xml:space="preserve">-0.46</w:t>
-                  </w:r>
-                </w:p>
-              </w:tc>
-              <w:tc>
-                <w:tcPr/>
-                <w:p>
-                  <w:pPr>
-                    <w:pStyle w:val="Compact"/>
-                    <w:jc w:val="right"/>
-                    <w:jc w:val="center"/>
-                  </w:pPr>
-                  <w:r>
-                    <w:t xml:space="preserve">0.648000</w:t>
+                    <w:t xml:space="preserve">-0.00315</w:t>
+                  </w:r>
+                </w:p>
+              </w:tc>
+              <w:tc>
+                <w:tcPr/>
+                <w:p>
+                  <w:pPr>
+                    <w:pStyle w:val="Compact"/>
+                    <w:jc w:val="right"/>
+                    <w:jc w:val="center"/>
+                  </w:pPr>
+                  <w:r>
+                    <w:t xml:space="preserve">0.00335</w:t>
+                  </w:r>
+                </w:p>
+              </w:tc>
+              <w:tc>
+                <w:tcPr/>
+                <w:p>
+                  <w:pPr>
+                    <w:pStyle w:val="Compact"/>
+                    <w:jc w:val="right"/>
+                    <w:jc w:val="center"/>
+                  </w:pPr>
+                  <w:r>
+                    <w:t xml:space="preserve">-0.94</w:t>
+                  </w:r>
+                </w:p>
+              </w:tc>
+              <w:tc>
+                <w:tcPr/>
+                <w:p>
+                  <w:pPr>
+                    <w:pStyle w:val="Compact"/>
+                    <w:jc w:val="right"/>
+                    <w:jc w:val="center"/>
+                  </w:pPr>
+                  <w:r>
+                    <w:t xml:space="preserve">0.34700</w:t>
                   </w:r>
                 </w:p>
               </w:tc>
@@ -4929,46 +4929,46 @@
                     <w:jc w:val="center"/>
                   </w:pPr>
                   <w:r>
-                    <w:t xml:space="preserve">-0.00840</w:t>
-                  </w:r>
-                </w:p>
-              </w:tc>
-              <w:tc>
-                <w:tcPr/>
-                <w:p>
-                  <w:pPr>
-                    <w:pStyle w:val="Compact"/>
-                    <w:jc w:val="right"/>
-                    <w:jc w:val="center"/>
-                  </w:pPr>
-                  <w:r>
-                    <w:t xml:space="preserve">0.00230</w:t>
-                  </w:r>
-                </w:p>
-              </w:tc>
-              <w:tc>
-                <w:tcPr/>
-                <w:p>
-                  <w:pPr>
-                    <w:pStyle w:val="Compact"/>
-                    <w:jc w:val="right"/>
-                    <w:jc w:val="center"/>
-                  </w:pPr>
-                  <w:r>
-                    <w:t xml:space="preserve">-3.65</w:t>
-                  </w:r>
-                </w:p>
-              </w:tc>
-              <w:tc>
-                <w:tcPr/>
-                <w:p>
-                  <w:pPr>
-                    <w:pStyle w:val="Compact"/>
-                    <w:jc w:val="right"/>
-                    <w:jc w:val="center"/>
-                  </w:pPr>
-                  <w:r>
-                    <w:t xml:space="preserve">0.000266</w:t>
+                    <w:t xml:space="preserve">-0.00372</w:t>
+                  </w:r>
+                </w:p>
+              </w:tc>
+              <w:tc>
+                <w:tcPr/>
+                <w:p>
+                  <w:pPr>
+                    <w:pStyle w:val="Compact"/>
+                    <w:jc w:val="right"/>
+                    <w:jc w:val="center"/>
+                  </w:pPr>
+                  <w:r>
+                    <w:t xml:space="preserve">0.00232</w:t>
+                  </w:r>
+                </w:p>
+              </w:tc>
+              <w:tc>
+                <w:tcPr/>
+                <w:p>
+                  <w:pPr>
+                    <w:pStyle w:val="Compact"/>
+                    <w:jc w:val="right"/>
+                    <w:jc w:val="center"/>
+                  </w:pPr>
+                  <w:r>
+                    <w:t xml:space="preserve">-1.60</w:t>
+                  </w:r>
+                </w:p>
+              </w:tc>
+              <w:tc>
+                <w:tcPr/>
+                <w:p>
+                  <w:pPr>
+                    <w:pStyle w:val="Compact"/>
+                    <w:jc w:val="right"/>
+                    <w:jc w:val="center"/>
+                  </w:pPr>
+                  <w:r>
+                    <w:t xml:space="preserve">0.10900</w:t>
                   </w:r>
                 </w:p>
               </w:tc>
@@ -6099,73 +6099,6 @@
                   </w:pPr>
                   <w:r>
                     <w:t xml:space="preserve">11,077</w:t>
-                  </w:r>
-                </w:p>
-              </w:tc>
-            </w:tr>
-            <w:tr>
-              <w:tc>
-                <w:tcPr/>
-                <w:p>
-                  <w:pPr>
-                    <w:pStyle w:val="Compact"/>
-                    <w:jc w:val="left"/>
-                    <w:jc w:val="center"/>
-                  </w:pPr>
-                  <w:r>
-                    <w:t xml:space="preserve">Diurnal subsample (N = 8,345): Body mass (+ capture time)</w:t>
-                  </w:r>
-                </w:p>
-              </w:tc>
-              <w:tc>
-                <w:tcPr/>
-                <w:p>
-                  <w:pPr>
-                    <w:pStyle w:val="Compact"/>
-                    <w:jc w:val="left"/>
-                    <w:jc w:val="center"/>
-                  </w:pPr>
-                  <w:r>
-                    <w:t xml:space="preserve">−0.0063</w:t>
-                  </w:r>
-                </w:p>
-              </w:tc>
-              <w:tc>
-                <w:tcPr/>
-                <w:p>
-                  <w:pPr>
-                    <w:pStyle w:val="Compact"/>
-                    <w:jc w:val="left"/>
-                    <w:jc w:val="center"/>
-                  </w:pPr>
-                  <w:r>
-                    <w:t xml:space="preserve">[−0.0188, 0.0062]</w:t>
-                  </w:r>
-                </w:p>
-              </w:tc>
-              <w:tc>
-                <w:tcPr/>
-                <w:p>
-                  <w:pPr>
-                    <w:pStyle w:val="Compact"/>
-                    <w:jc w:val="left"/>
-                    <w:jc w:val="center"/>
-                  </w:pPr>
-                  <w:r>
-                    <w:t xml:space="preserve">−1.3%</w:t>
-                  </w:r>
-                </w:p>
-              </w:tc>
-              <w:tc>
-                <w:tcPr/>
-                <w:p>
-                  <w:pPr>
-                    <w:pStyle w:val="Compact"/>
-                    <w:jc w:val="left"/>
-                    <w:jc w:val="center"/>
-                  </w:pPr>
-                  <w:r>
-                    <w:t xml:space="preserve">8,345</w:t>
                   </w:r>
                 </w:p>
               </w:tc>

</xml_diff>